<commit_message>
feat: actualizar formato de acta conformidad y ticket de pesaje en analytica
</commit_message>
<xml_diff>
--- a/pesaje/analytica/Report/PrintLoteGuiaRecepcion.docx
+++ b/pesaje/analytica/Report/PrintLoteGuiaRecepcion.docx
@@ -310,18 +310,6 @@
                     <w:lang w:val="it-IT"/>
                   </w:rPr>
                   <w:fldChar w:fldCharType="separate"/>
-                </w:r>
-                <w:r>
-                  <w:rPr>
-                    <w:rFonts w:ascii="Arial" w:hAnsi="Arial" w:cs="Arial"/>
-                    <w:b/>
-                    <w:bCs/>
-                    <w:noProof/>
-                    <w:sz w:val="14"/>
-                    <w:szCs w:val="14"/>
-                    <w:lang w:val="it-IT"/>
-                  </w:rPr>
-                  <w:t>«razon_social_empresa»</w:t>
                 </w:r>
                 <w:r>
                   <w:rPr>
@@ -3831,7 +3819,6 @@
     <w:sig w:usb0="00000287" w:usb1="00000000" w:usb2="00000000" w:usb3="00000000" w:csb0="0000009F" w:csb1="00000000"/>
   </w:font>
   <w:font w:name="MS Mincho">
-    <w:altName w:val="ＭＳ 明朝"/>
     <w:panose1 w:val="02020609040205080304"/>
     <w:charset w:val="80"/>
     <w:family w:val="modern"/>
@@ -3893,7 +3880,6 @@
     <w:sig w:usb0="20000287" w:usb1="00000003" w:usb2="00000000" w:usb3="00000000" w:csb0="0000019F" w:csb1="00000000"/>
   </w:font>
   <w:font w:name="DengXian">
-    <w:altName w:val="等线"/>
     <w:panose1 w:val="02010600030101010101"/>
     <w:charset w:val="86"/>
     <w:family w:val="auto"/>
@@ -3951,6 +3937,7 @@
     <w:rsid w:val="002A782B"/>
     <w:rsid w:val="003542C1"/>
     <w:rsid w:val="00366529"/>
+    <w:rsid w:val="003B0DB5"/>
     <w:rsid w:val="003C2481"/>
     <w:rsid w:val="003D1706"/>
     <w:rsid w:val="003F52EF"/>
@@ -3962,6 +3949,7 @@
     <w:rsid w:val="005E2BC5"/>
     <w:rsid w:val="0065207D"/>
     <w:rsid w:val="00652BF8"/>
+    <w:rsid w:val="00656548"/>
     <w:rsid w:val="00684299"/>
     <w:rsid w:val="00694628"/>
     <w:rsid w:val="006B3E0C"/>
@@ -4765,6 +4753,23 @@
 </file>
 
 <file path=customXml/item2.xml><?xml version="1.0" encoding="utf-8"?>
+<?mso-contentType ?>
+<FormTemplates xmlns="http://schemas.microsoft.com/sharepoint/v3/contenttype/forms">
+  <Display>DocumentLibraryForm</Display>
+  <Edit>DocumentLibraryForm</Edit>
+  <New>DocumentLibraryForm</New>
+</FormTemplates>
+</file>
+
+<file path=customXml/item3.xml><?xml version="1.0" encoding="utf-8"?>
+<p:properties xmlns:p="http://schemas.microsoft.com/office/2006/metadata/properties" xmlns:xsi="http://www.w3.org/2001/XMLSchema-instance" xmlns:pc="http://schemas.microsoft.com/office/infopath/2007/PartnerControls">
+  <documentManagement>
+    <MediaServiceKeyPoints xmlns="71af3243-3dd4-4a8d-8c0d-dd76da1f02a5" xsi:nil="true"/>
+  </documentManagement>
+</p:properties>
+</file>
+
+<file path=customXml/item4.xml><?xml version="1.0" encoding="utf-8"?>
 <ct:contentTypeSchema xmlns:ct="http://schemas.microsoft.com/office/2006/metadata/contentType" xmlns:ma="http://schemas.microsoft.com/office/2006/metadata/properties/metaAttributes" ct:_="" ma:_="" ma:contentTypeName="Document" ma:contentTypeID="0x01010079F111ED35F8CC479449609E8A0923A6" ma:contentTypeVersion="11" ma:contentTypeDescription="Create a new document." ma:contentTypeScope="" ma:versionID="1c2eb7a32e66fb6e4260f3771546a5e2">
   <xsd:schema xmlns:xsd="http://www.w3.org/2001/XMLSchema" xmlns:xs="http://www.w3.org/2001/XMLSchema" xmlns:p="http://schemas.microsoft.com/office/2006/metadata/properties" xmlns:ns2="71af3243-3dd4-4a8d-8c0d-dd76da1f02a5" xmlns:ns3="16c05727-aa75-4e4a-9b5f-8a80a1165891" targetNamespace="http://schemas.microsoft.com/office/2006/metadata/properties" ma:root="true" ma:fieldsID="04e1f6479c48b08974ba73b5ca973489" ns2:_="" ns3:_="">
     <xsd:import namespace="71af3243-3dd4-4a8d-8c0d-dd76da1f02a5"/>
@@ -4975,23 +4980,6 @@
 </ct:contentTypeSchema>
 </file>
 
-<file path=customXml/item3.xml><?xml version="1.0" encoding="utf-8"?>
-<p:properties xmlns:p="http://schemas.microsoft.com/office/2006/metadata/properties" xmlns:xsi="http://www.w3.org/2001/XMLSchema-instance" xmlns:pc="http://schemas.microsoft.com/office/infopath/2007/PartnerControls">
-  <documentManagement>
-    <MediaServiceKeyPoints xmlns="71af3243-3dd4-4a8d-8c0d-dd76da1f02a5" xsi:nil="true"/>
-  </documentManagement>
-</p:properties>
-</file>
-
-<file path=customXml/item4.xml><?xml version="1.0" encoding="utf-8"?>
-<?mso-contentType ?>
-<FormTemplates xmlns="http://schemas.microsoft.com/sharepoint/v3/contenttype/forms">
-  <Display>DocumentLibraryForm</Display>
-  <Edit>DocumentLibraryForm</Edit>
-  <New>DocumentLibraryForm</New>
-</FormTemplates>
-</file>
-
 <file path=customXml/itemProps1.xml><?xml version="1.0" encoding="utf-8"?>
 <ds:datastoreItem xmlns:ds="http://schemas.openxmlformats.org/officeDocument/2006/customXml" ds:itemID="{15FB23E4-45D6-411F-89ED-62A8EB1B1927}">
   <ds:schemaRefs>
@@ -5001,6 +4989,24 @@
 </file>
 
 <file path=customXml/itemProps2.xml><?xml version="1.0" encoding="utf-8"?>
+<ds:datastoreItem xmlns:ds="http://schemas.openxmlformats.org/officeDocument/2006/customXml" ds:itemID="{BEA6D05B-AD60-405F-B8DB-FC61ABCDF8E2}">
+  <ds:schemaRefs>
+    <ds:schemaRef ds:uri="http://schemas.microsoft.com/sharepoint/v3/contenttype/forms"/>
+  </ds:schemaRefs>
+</ds:datastoreItem>
+</file>
+
+<file path=customXml/itemProps3.xml><?xml version="1.0" encoding="utf-8"?>
+<ds:datastoreItem xmlns:ds="http://schemas.openxmlformats.org/officeDocument/2006/customXml" ds:itemID="{B550BB7C-2FBC-4612-9ECE-2EA076035D14}">
+  <ds:schemaRefs>
+    <ds:schemaRef ds:uri="http://schemas.microsoft.com/office/2006/metadata/properties"/>
+    <ds:schemaRef ds:uri="http://schemas.microsoft.com/office/infopath/2007/PartnerControls"/>
+    <ds:schemaRef ds:uri="71af3243-3dd4-4a8d-8c0d-dd76da1f02a5"/>
+  </ds:schemaRefs>
+</ds:datastoreItem>
+</file>
+
+<file path=customXml/itemProps4.xml><?xml version="1.0" encoding="utf-8"?>
 <ds:datastoreItem xmlns:ds="http://schemas.openxmlformats.org/officeDocument/2006/customXml" ds:itemID="{23573660-FE3A-4463-827C-CAE2430F8500}">
   <ds:schemaRefs>
     <ds:schemaRef ds:uri="http://schemas.microsoft.com/office/2006/metadata/contentType"/>
@@ -5017,22 +5023,4 @@
     <ds:schemaRef ds:uri="http://schemas.microsoft.com/internal/obd"/>
   </ds:schemaRefs>
 </ds:datastoreItem>
-</file>
-
-<file path=customXml/itemProps3.xml><?xml version="1.0" encoding="utf-8"?>
-<ds:datastoreItem xmlns:ds="http://schemas.openxmlformats.org/officeDocument/2006/customXml" ds:itemID="{B550BB7C-2FBC-4612-9ECE-2EA076035D14}">
-  <ds:schemaRefs>
-    <ds:schemaRef ds:uri="http://schemas.microsoft.com/office/2006/metadata/properties"/>
-    <ds:schemaRef ds:uri="http://schemas.microsoft.com/office/infopath/2007/PartnerControls"/>
-    <ds:schemaRef ds:uri="71af3243-3dd4-4a8d-8c0d-dd76da1f02a5"/>
-  </ds:schemaRefs>
-</ds:datastoreItem>
-</file>
-
-<file path=customXml/itemProps4.xml><?xml version="1.0" encoding="utf-8"?>
-<ds:datastoreItem xmlns:ds="http://schemas.openxmlformats.org/officeDocument/2006/customXml" ds:itemID="{BEA6D05B-AD60-405F-B8DB-FC61ABCDF8E2}">
-  <ds:schemaRefs>
-    <ds:schemaRef ds:uri="http://schemas.microsoft.com/sharepoint/v3/contenttype/forms"/>
-  </ds:schemaRefs>
-</ds:datastoreItem>
 </file>
</xml_diff>

<commit_message>
actualizar tamaño de logos
</commit_message>
<xml_diff>
--- a/pesaje/analytica/Report/PrintLoteGuiaRecepcion.docx
+++ b/pesaje/analytica/Report/PrintLoteGuiaRecepcion.docx
@@ -39,15 +39,15 @@
               <mc:AlternateContent>
                 <mc:Choice Requires="wps">
                   <w:drawing>
-                    <wp:anchor distT="0" distB="0" distL="114300" distR="114300" simplePos="0" relativeHeight="251669504" behindDoc="0" locked="0" layoutInCell="1" allowOverlap="1" wp14:anchorId="522B1D2F" wp14:editId="4DAA7482">
+                    <wp:anchor distT="0" distB="0" distL="114300" distR="114300" simplePos="0" relativeHeight="251669504" behindDoc="0" locked="0" layoutInCell="1" allowOverlap="1" wp14:anchorId="522B1D2F" wp14:editId="49185D33">
                       <wp:simplePos x="0" y="0"/>
                       <wp:positionH relativeFrom="margin">
-                        <wp:posOffset>49624</wp:posOffset>
+                        <wp:posOffset>50800</wp:posOffset>
                       </wp:positionH>
                       <wp:positionV relativeFrom="paragraph">
-                        <wp:posOffset>21788</wp:posOffset>
+                        <wp:posOffset>24765</wp:posOffset>
                       </wp:positionV>
-                      <wp:extent cx="1903521" cy="771910"/>
+                      <wp:extent cx="1903521" cy="906780"/>
                       <wp:effectExtent l="0" t="0" r="0" b="0"/>
                       <wp:wrapNone/>
                       <wp:docPr id="1154350600" name="Rectángulo: esquinas redondeadas 1154350600"/>
@@ -63,7 +63,7 @@
                             <wps:spPr bwMode="auto">
                               <a:xfrm>
                                 <a:off x="0" y="0"/>
-                                <a:ext cx="1903521" cy="771910"/>
+                                <a:ext cx="1903521" cy="906780"/>
                               </a:xfrm>
                               <a:prstGeom prst="roundRect">
                                 <a:avLst>
@@ -145,7 +145,7 @@
                 </mc:Choice>
                 <mc:Fallback>
                   <w:pict>
-                    <v:roundrect w14:anchorId="522B1D2F" id="Rectángulo: esquinas redondeadas 1154350600" o:spid="_x0000_s1026" style="position:absolute;margin-left:3.9pt;margin-top:1.7pt;width:149.9pt;height:60.8pt;z-index:251669504;visibility:visible;mso-wrap-style:square;mso-width-percent:0;mso-height-percent:0;mso-wrap-distance-left:9pt;mso-wrap-distance-top:0;mso-wrap-distance-right:9pt;mso-wrap-distance-bottom:0;mso-position-horizontal:absolute;mso-position-horizontal-relative:margin;mso-position-vertical:absolute;mso-position-vertical-relative:text;mso-width-percent:0;mso-height-percent:0;mso-width-relative:margin;mso-height-relative:margin;v-text-anchor:top" arcsize="10923f" o:gfxdata="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" filled="f" stroked="f">
+                    <v:roundrect w14:anchorId="522B1D2F" id="Rectángulo: esquinas redondeadas 1154350600" o:spid="_x0000_s1026" style="position:absolute;margin-left:4pt;margin-top:1.95pt;width:149.9pt;height:71.4pt;z-index:251669504;visibility:visible;mso-wrap-style:square;mso-width-percent:0;mso-height-percent:0;mso-wrap-distance-left:9pt;mso-wrap-distance-top:0;mso-wrap-distance-right:9pt;mso-wrap-distance-bottom:0;mso-position-horizontal:absolute;mso-position-horizontal-relative:margin;mso-position-vertical:absolute;mso-position-vertical-relative:text;mso-width-percent:0;mso-height-percent:0;mso-width-relative:margin;mso-height-relative:margin;v-text-anchor:top" arcsize="10923f" o:gfxdata="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" filled="f" stroked="f">
                       <v:stroke joinstyle="miter"/>
                       <v:textbox>
                         <w:txbxContent>
@@ -3946,6 +3946,7 @@
     <w:rsid w:val="00531EA1"/>
     <w:rsid w:val="005613DE"/>
     <w:rsid w:val="005D2175"/>
+    <w:rsid w:val="005D4DCC"/>
     <w:rsid w:val="005E2BC5"/>
     <w:rsid w:val="0065207D"/>
     <w:rsid w:val="00652BF8"/>
@@ -3958,6 +3959,7 @@
     <w:rsid w:val="007E1635"/>
     <w:rsid w:val="007E5123"/>
     <w:rsid w:val="0086542D"/>
+    <w:rsid w:val="0087048C"/>
     <w:rsid w:val="008D65D8"/>
     <w:rsid w:val="009126E4"/>
     <w:rsid w:val="009626AB"/>
@@ -4749,27 +4751,6 @@
 </file>
 
 <file path=customXml/item1.xml><?xml version="1.0" encoding="utf-8"?>
-<b:Sources xmlns:b="http://schemas.openxmlformats.org/officeDocument/2006/bibliography" xmlns="http://schemas.openxmlformats.org/officeDocument/2006/bibliography" SelectedStyle="\APASixthEditionOfficeOnline.xsl" StyleName="APA" Version="6"/>
-</file>
-
-<file path=customXml/item2.xml><?xml version="1.0" encoding="utf-8"?>
-<?mso-contentType ?>
-<FormTemplates xmlns="http://schemas.microsoft.com/sharepoint/v3/contenttype/forms">
-  <Display>DocumentLibraryForm</Display>
-  <Edit>DocumentLibraryForm</Edit>
-  <New>DocumentLibraryForm</New>
-</FormTemplates>
-</file>
-
-<file path=customXml/item3.xml><?xml version="1.0" encoding="utf-8"?>
-<p:properties xmlns:p="http://schemas.microsoft.com/office/2006/metadata/properties" xmlns:xsi="http://www.w3.org/2001/XMLSchema-instance" xmlns:pc="http://schemas.microsoft.com/office/infopath/2007/PartnerControls">
-  <documentManagement>
-    <MediaServiceKeyPoints xmlns="71af3243-3dd4-4a8d-8c0d-dd76da1f02a5" xsi:nil="true"/>
-  </documentManagement>
-</p:properties>
-</file>
-
-<file path=customXml/item4.xml><?xml version="1.0" encoding="utf-8"?>
 <ct:contentTypeSchema xmlns:ct="http://schemas.microsoft.com/office/2006/metadata/contentType" xmlns:ma="http://schemas.microsoft.com/office/2006/metadata/properties/metaAttributes" ct:_="" ma:_="" ma:contentTypeName="Document" ma:contentTypeID="0x01010079F111ED35F8CC479449609E8A0923A6" ma:contentTypeVersion="11" ma:contentTypeDescription="Create a new document." ma:contentTypeScope="" ma:versionID="1c2eb7a32e66fb6e4260f3771546a5e2">
   <xsd:schema xmlns:xsd="http://www.w3.org/2001/XMLSchema" xmlns:xs="http://www.w3.org/2001/XMLSchema" xmlns:p="http://schemas.microsoft.com/office/2006/metadata/properties" xmlns:ns2="71af3243-3dd4-4a8d-8c0d-dd76da1f02a5" xmlns:ns3="16c05727-aa75-4e4a-9b5f-8a80a1165891" targetNamespace="http://schemas.microsoft.com/office/2006/metadata/properties" ma:root="true" ma:fieldsID="04e1f6479c48b08974ba73b5ca973489" ns2:_="" ns3:_="">
     <xsd:import namespace="71af3243-3dd4-4a8d-8c0d-dd76da1f02a5"/>
@@ -4980,33 +4961,28 @@
 </ct:contentTypeSchema>
 </file>
 
-<file path=customXml/itemProps1.xml><?xml version="1.0" encoding="utf-8"?>
-<ds:datastoreItem xmlns:ds="http://schemas.openxmlformats.org/officeDocument/2006/customXml" ds:itemID="{15FB23E4-45D6-411F-89ED-62A8EB1B1927}">
-  <ds:schemaRefs>
-    <ds:schemaRef ds:uri="http://schemas.openxmlformats.org/officeDocument/2006/bibliography"/>
-  </ds:schemaRefs>
-</ds:datastoreItem>
+<file path=customXml/item2.xml><?xml version="1.0" encoding="utf-8"?>
+<p:properties xmlns:p="http://schemas.microsoft.com/office/2006/metadata/properties" xmlns:xsi="http://www.w3.org/2001/XMLSchema-instance" xmlns:pc="http://schemas.microsoft.com/office/infopath/2007/PartnerControls">
+  <documentManagement>
+    <MediaServiceKeyPoints xmlns="71af3243-3dd4-4a8d-8c0d-dd76da1f02a5" xsi:nil="true"/>
+  </documentManagement>
+</p:properties>
 </file>
 
-<file path=customXml/itemProps2.xml><?xml version="1.0" encoding="utf-8"?>
-<ds:datastoreItem xmlns:ds="http://schemas.openxmlformats.org/officeDocument/2006/customXml" ds:itemID="{BEA6D05B-AD60-405F-B8DB-FC61ABCDF8E2}">
-  <ds:schemaRefs>
-    <ds:schemaRef ds:uri="http://schemas.microsoft.com/sharepoint/v3/contenttype/forms"/>
-  </ds:schemaRefs>
-</ds:datastoreItem>
+<file path=customXml/item3.xml><?xml version="1.0" encoding="utf-8"?>
+<?mso-contentType ?>
+<FormTemplates xmlns="http://schemas.microsoft.com/sharepoint/v3/contenttype/forms">
+  <Display>DocumentLibraryForm</Display>
+  <Edit>DocumentLibraryForm</Edit>
+  <New>DocumentLibraryForm</New>
+</FormTemplates>
 </file>
 
-<file path=customXml/itemProps3.xml><?xml version="1.0" encoding="utf-8"?>
-<ds:datastoreItem xmlns:ds="http://schemas.openxmlformats.org/officeDocument/2006/customXml" ds:itemID="{B550BB7C-2FBC-4612-9ECE-2EA076035D14}">
-  <ds:schemaRefs>
-    <ds:schemaRef ds:uri="http://schemas.microsoft.com/office/2006/metadata/properties"/>
-    <ds:schemaRef ds:uri="http://schemas.microsoft.com/office/infopath/2007/PartnerControls"/>
-    <ds:schemaRef ds:uri="71af3243-3dd4-4a8d-8c0d-dd76da1f02a5"/>
-  </ds:schemaRefs>
-</ds:datastoreItem>
+<file path=customXml/item4.xml><?xml version="1.0" encoding="utf-8"?>
+<b:Sources xmlns:b="http://schemas.openxmlformats.org/officeDocument/2006/bibliography" xmlns="http://schemas.openxmlformats.org/officeDocument/2006/bibliography" SelectedStyle="\APASixthEditionOfficeOnline.xsl" StyleName="APA" Version="6"/>
 </file>
 
-<file path=customXml/itemProps4.xml><?xml version="1.0" encoding="utf-8"?>
+<file path=customXml/itemProps1.xml><?xml version="1.0" encoding="utf-8"?>
 <ds:datastoreItem xmlns:ds="http://schemas.openxmlformats.org/officeDocument/2006/customXml" ds:itemID="{23573660-FE3A-4463-827C-CAE2430F8500}">
   <ds:schemaRefs>
     <ds:schemaRef ds:uri="http://schemas.microsoft.com/office/2006/metadata/contentType"/>
@@ -5023,4 +4999,30 @@
     <ds:schemaRef ds:uri="http://schemas.microsoft.com/internal/obd"/>
   </ds:schemaRefs>
 </ds:datastoreItem>
+</file>
+
+<file path=customXml/itemProps2.xml><?xml version="1.0" encoding="utf-8"?>
+<ds:datastoreItem xmlns:ds="http://schemas.openxmlformats.org/officeDocument/2006/customXml" ds:itemID="{B550BB7C-2FBC-4612-9ECE-2EA076035D14}">
+  <ds:schemaRefs>
+    <ds:schemaRef ds:uri="http://schemas.microsoft.com/office/2006/metadata/properties"/>
+    <ds:schemaRef ds:uri="http://schemas.microsoft.com/office/infopath/2007/PartnerControls"/>
+    <ds:schemaRef ds:uri="71af3243-3dd4-4a8d-8c0d-dd76da1f02a5"/>
+  </ds:schemaRefs>
+</ds:datastoreItem>
+</file>
+
+<file path=customXml/itemProps3.xml><?xml version="1.0" encoding="utf-8"?>
+<ds:datastoreItem xmlns:ds="http://schemas.openxmlformats.org/officeDocument/2006/customXml" ds:itemID="{BEA6D05B-AD60-405F-B8DB-FC61ABCDF8E2}">
+  <ds:schemaRefs>
+    <ds:schemaRef ds:uri="http://schemas.microsoft.com/sharepoint/v3/contenttype/forms"/>
+  </ds:schemaRefs>
+</ds:datastoreItem>
+</file>
+
+<file path=customXml/itemProps4.xml><?xml version="1.0" encoding="utf-8"?>
+<ds:datastoreItem xmlns:ds="http://schemas.openxmlformats.org/officeDocument/2006/customXml" ds:itemID="{15FB23E4-45D6-411F-89ED-62A8EB1B1927}">
+  <ds:schemaRefs>
+    <ds:schemaRef ds:uri="http://schemas.openxmlformats.org/officeDocument/2006/bibliography"/>
+  </ds:schemaRefs>
+</ds:datastoreItem>
 </file>
</xml_diff>

<commit_message>
chore: cambiar tamaño y orientacion de la plantilla de acta de conformidad
</commit_message>
<xml_diff>
--- a/pesaje/analytica/Report/PrintLoteGuiaRecepcion.docx
+++ b/pesaje/analytica/Report/PrintLoteGuiaRecepcion.docx
@@ -1,6 +1,6 @@
 
 <file path=word/document.xml><?xml version="1.0" encoding="utf-8"?>
-<w:document xmlns:wpc="http://schemas.microsoft.com/office/word/2010/wordprocessingCanvas" xmlns:cx="http://schemas.microsoft.com/office/drawing/2014/chartex" xmlns:cx1="http://schemas.microsoft.com/office/drawing/2015/9/8/chartex" xmlns:cx2="http://schemas.microsoft.com/office/drawing/2015/10/21/chartex" xmlns:cx3="http://schemas.microsoft.com/office/drawing/2016/5/9/chartex" xmlns:cx4="http://schemas.microsoft.com/office/drawing/2016/5/10/chartex" xmlns:cx5="http://schemas.microsoft.com/office/drawing/2016/5/11/chartex" xmlns:cx6="http://schemas.microsoft.com/office/drawing/2016/5/12/chartex" xmlns:cx7="http://schemas.microsoft.com/office/drawing/2016/5/13/chartex" xmlns:cx8="http://schemas.microsoft.com/office/drawing/2016/5/14/chartex" xmlns:mc="http://schemas.openxmlformats.org/markup-compatibility/2006" xmlns:aink="http://schemas.microsoft.com/office/drawing/2016/ink" xmlns:am3d="http://schemas.microsoft.com/office/drawing/2017/model3d" xmlns:o="urn:schemas-microsoft-com:office:office" xmlns:r="http://schemas.openxmlformats.org/officeDocument/2006/relationships" xmlns:m="http://schemas.openxmlformats.org/officeDocument/2006/math" xmlns:v="urn:schemas-microsoft-com:vml" xmlns:wp14="http://schemas.microsoft.com/office/word/2010/wordprocessingDrawing" xmlns:wp="http://schemas.openxmlformats.org/drawingml/2006/wordprocessingDrawing" xmlns:w10="urn:schemas-microsoft-com:office:word" xmlns:w="http://schemas.openxmlformats.org/wordprocessingml/2006/main" xmlns:w14="http://schemas.microsoft.com/office/word/2010/wordml" xmlns:w15="http://schemas.microsoft.com/office/word/2012/wordml" xmlns:w16cex="http://schemas.microsoft.com/office/word/2018/wordml/cex" xmlns:w16cid="http://schemas.microsoft.com/office/word/2016/wordml/cid" xmlns:w16="http://schemas.microsoft.com/office/word/2018/wordml" xmlns:w16sdtdh="http://schemas.microsoft.com/office/word/2020/wordml/sdtdatahash" xmlns:w16se="http://schemas.microsoft.com/office/word/2015/wordml/symex" xmlns:wpg="http://schemas.microsoft.com/office/word/2010/wordprocessingGroup" xmlns:wpi="http://schemas.microsoft.com/office/word/2010/wordprocessingInk" xmlns:wne="http://schemas.microsoft.com/office/word/2006/wordml" xmlns:wps="http://schemas.microsoft.com/office/word/2010/wordprocessingShape" mc:Ignorable="w14 w15 w16se w16cid w16 w16cex w16sdtdh wp14">
+<w:document xmlns:wpc="http://schemas.microsoft.com/office/word/2010/wordprocessingCanvas" xmlns:cx="http://schemas.microsoft.com/office/drawing/2014/chartex" xmlns:cx1="http://schemas.microsoft.com/office/drawing/2015/9/8/chartex" xmlns:cx2="http://schemas.microsoft.com/office/drawing/2015/10/21/chartex" xmlns:cx3="http://schemas.microsoft.com/office/drawing/2016/5/9/chartex" xmlns:cx4="http://schemas.microsoft.com/office/drawing/2016/5/10/chartex" xmlns:cx5="http://schemas.microsoft.com/office/drawing/2016/5/11/chartex" xmlns:cx6="http://schemas.microsoft.com/office/drawing/2016/5/12/chartex" xmlns:cx7="http://schemas.microsoft.com/office/drawing/2016/5/13/chartex" xmlns:cx8="http://schemas.microsoft.com/office/drawing/2016/5/14/chartex" xmlns:mc="http://schemas.openxmlformats.org/markup-compatibility/2006" xmlns:aink="http://schemas.microsoft.com/office/drawing/2016/ink" xmlns:am3d="http://schemas.microsoft.com/office/drawing/2017/model3d" xmlns:o="urn:schemas-microsoft-com:office:office" xmlns:oel="http://schemas.microsoft.com/office/2019/extlst" xmlns:r="http://schemas.openxmlformats.org/officeDocument/2006/relationships" xmlns:m="http://schemas.openxmlformats.org/officeDocument/2006/math" xmlns:v="urn:schemas-microsoft-com:vml" xmlns:wp14="http://schemas.microsoft.com/office/word/2010/wordprocessingDrawing" xmlns:wp="http://schemas.openxmlformats.org/drawingml/2006/wordprocessingDrawing" xmlns:w10="urn:schemas-microsoft-com:office:word" xmlns:w="http://schemas.openxmlformats.org/wordprocessingml/2006/main" xmlns:w14="http://schemas.microsoft.com/office/word/2010/wordml" xmlns:w15="http://schemas.microsoft.com/office/word/2012/wordml" xmlns:w16cex="http://schemas.microsoft.com/office/word/2018/wordml/cex" xmlns:w16cid="http://schemas.microsoft.com/office/word/2016/wordml/cid" xmlns:w16="http://schemas.microsoft.com/office/word/2018/wordml" xmlns:w16du="http://schemas.microsoft.com/office/word/2023/wordml/word16du" xmlns:w16sdtdh="http://schemas.microsoft.com/office/word/2020/wordml/sdtdatahash" xmlns:w16sdtfl="http://schemas.microsoft.com/office/word/2024/wordml/sdtformatlock" xmlns:w16se="http://schemas.microsoft.com/office/word/2015/wordml/symex" xmlns:wpg="http://schemas.microsoft.com/office/word/2010/wordprocessingGroup" xmlns:wpi="http://schemas.microsoft.com/office/word/2010/wordprocessingInk" xmlns:wne="http://schemas.microsoft.com/office/word/2006/wordml" xmlns:wps="http://schemas.microsoft.com/office/word/2010/wordprocessingShape" mc:Ignorable="w14 w15 w16se w16cid w16 w16cex w16sdtdh w16sdtfl w16du wp14">
   <w:body>
     <w:tbl>
       <w:tblPr>
@@ -18,8 +18,8 @@
         <w:tblDescription w:val="Tabla de diseño de encabezado"/>
       </w:tblPr>
       <w:tblGrid>
-        <w:gridCol w:w="3400"/>
-        <w:gridCol w:w="7826"/>
+        <w:gridCol w:w="3264"/>
+        <w:gridCol w:w="7576"/>
       </w:tblGrid>
       <w:tr>
         <w:trPr>
@@ -57,20 +57,17 @@
           <w:p>
             <w:pPr>
               <w:rPr>
+                <w:b/>
+                <w:bCs/>
+                <w:sz w:val="28"/>
+                <w:szCs w:val="28"/>
+                <w:u w:val="single"/>
                 <w:lang w:val="es-PE"/>
               </w:rPr>
             </w:pPr>
           </w:p>
           <w:p>
             <w:pPr>
-              <w:rPr>
-                <w:lang w:val="es-PE"/>
-              </w:rPr>
-            </w:pPr>
-          </w:p>
-          <w:p>
-            <w:pPr>
-              <w:jc w:val="center"/>
               <w:rPr>
                 <w:b/>
                 <w:bCs/>
@@ -328,12 +325,12 @@
         <w:tblDescription w:val="Tabla de diseño de encabezado"/>
       </w:tblPr>
       <w:tblGrid>
-        <w:gridCol w:w="708"/>
-        <w:gridCol w:w="1132"/>
-        <w:gridCol w:w="1842"/>
-        <w:gridCol w:w="1416"/>
-        <w:gridCol w:w="993"/>
-        <w:gridCol w:w="5116"/>
+        <w:gridCol w:w="689"/>
+        <w:gridCol w:w="1097"/>
+        <w:gridCol w:w="1779"/>
+        <w:gridCol w:w="1369"/>
+        <w:gridCol w:w="963"/>
+        <w:gridCol w:w="4924"/>
       </w:tblGrid>
       <w:tr>
         <w:trPr>
@@ -996,7 +993,7 @@
           </mc:Choice>
           <mc:Fallback>
             <w:pict>
-              <v:roundrect w14:anchorId="522B1D2F" id="Rectángulo: esquinas redondeadas 1154350600" o:spid="_x0000_s1026" style="position:absolute;margin-left:1pt;margin-top:-156.15pt;width:168pt;height:62.25pt;z-index:251669504;visibility:visible;mso-wrap-style:square;mso-width-percent:0;mso-height-percent:0;mso-wrap-distance-left:9pt;mso-wrap-distance-top:0;mso-wrap-distance-right:9pt;mso-wrap-distance-bottom:0;mso-position-horizontal:absolute;mso-position-horizontal-relative:margin;mso-position-vertical:absolute;mso-position-vertical-relative:text;mso-width-percent:0;mso-height-percent:0;mso-width-relative:margin;mso-height-relative:margin;v-text-anchor:top" arcsize="10923f" o:gfxdata="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" filled="f" stroked="f">
+              <v:roundrect w14:anchorId="522B1D2F" id="Rectángulo: esquinas redondeadas 1154350600" o:spid="_x0000_s1026" style="position:absolute;margin-left:1pt;margin-top:-156.15pt;width:168pt;height:62.25pt;z-index:251669504;visibility:visible;mso-wrap-style:square;mso-width-percent:0;mso-height-percent:0;mso-wrap-distance-left:9pt;mso-wrap-distance-top:0;mso-wrap-distance-right:9pt;mso-wrap-distance-bottom:0;mso-position-horizontal:absolute;mso-position-horizontal-relative:margin;mso-position-vertical:absolute;mso-position-vertical-relative:text;mso-width-percent:0;mso-height-percent:0;mso-width-relative:margin;mso-height-relative:margin;v-text-anchor:top" arcsize="10923f" o:gfxdata="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" filled="f" stroked="f">
                 <v:stroke joinstyle="miter"/>
                 <v:textbox>
                   <w:txbxContent>
@@ -1070,12 +1067,12 @@
         <w:tblLook w:val="04A0" w:firstRow="1" w:lastRow="0" w:firstColumn="1" w:lastColumn="0" w:noHBand="0" w:noVBand="1"/>
       </w:tblPr>
       <w:tblGrid>
-        <w:gridCol w:w="709"/>
-        <w:gridCol w:w="1129"/>
-        <w:gridCol w:w="1843"/>
-        <w:gridCol w:w="1422"/>
-        <w:gridCol w:w="993"/>
-        <w:gridCol w:w="5120"/>
+        <w:gridCol w:w="686"/>
+        <w:gridCol w:w="1085"/>
+        <w:gridCol w:w="1805"/>
+        <w:gridCol w:w="1406"/>
+        <w:gridCol w:w="975"/>
+        <w:gridCol w:w="4883"/>
       </w:tblGrid>
       <w:tr>
         <w:tc>
@@ -1403,18 +1400,10 @@
         </w:tc>
       </w:tr>
     </w:tbl>
-    <w:p>
-      <w:pPr>
-        <w:rPr>
-          <w:sz w:val="10"/>
-          <w:szCs w:val="10"/>
-        </w:rPr>
-      </w:pPr>
-    </w:p>
     <w:tbl>
       <w:tblPr>
         <w:tblStyle w:val="Tablaconcuadrcula"/>
-        <w:tblpPr w:leftFromText="141" w:rightFromText="141" w:vertAnchor="text" w:horzAnchor="margin" w:tblpY="2927"/>
+        <w:tblpPr w:leftFromText="141" w:rightFromText="141" w:vertAnchor="text" w:horzAnchor="page" w:tblpX="1078" w:tblpY="711"/>
         <w:tblW w:w="0" w:type="auto"/>
         <w:tblBorders>
           <w:top w:val="none" w:sz="0" w:space="0" w:color="auto"/>
@@ -1427,17 +1416,17 @@
         <w:tblLook w:val="04A0" w:firstRow="1" w:lastRow="0" w:firstColumn="1" w:lastColumn="0" w:noHBand="0" w:noVBand="1"/>
       </w:tblPr>
       <w:tblGrid>
-        <w:gridCol w:w="5608"/>
-        <w:gridCol w:w="5165"/>
-        <w:gridCol w:w="443"/>
+        <w:gridCol w:w="5954"/>
+        <w:gridCol w:w="4092"/>
+        <w:gridCol w:w="419"/>
       </w:tblGrid>
       <w:tr>
         <w:trPr>
-          <w:trHeight w:val="695"/>
+          <w:trHeight w:val="821"/>
         </w:trPr>
         <w:tc>
           <w:tcPr>
-            <w:tcW w:w="10773" w:type="dxa"/>
+            <w:tcW w:w="10046" w:type="dxa"/>
             <w:gridSpan w:val="2"/>
           </w:tcPr>
           <w:p>
@@ -1481,7 +1470,7 @@
               <mc:AlternateContent>
                 <mc:Choice Requires="wps">
                   <w:drawing>
-                    <wp:anchor distT="0" distB="0" distL="114300" distR="114300" simplePos="0" relativeHeight="251671552" behindDoc="0" locked="0" layoutInCell="1" allowOverlap="1" wp14:anchorId="718F031A" wp14:editId="167701E5">
+                    <wp:anchor distT="0" distB="0" distL="114300" distR="114300" simplePos="0" relativeHeight="251671552" behindDoc="0" locked="0" layoutInCell="1" allowOverlap="1" wp14:anchorId="3166EB96" wp14:editId="5468AAA3">
                       <wp:simplePos x="0" y="0"/>
                       <wp:positionH relativeFrom="column">
                         <wp:posOffset>1964690</wp:posOffset>
@@ -1534,9 +1523,9 @@
                     </wp:anchor>
                   </w:drawing>
                 </mc:Choice>
-                <mc:Fallback xmlns:w16sdtfl="http://schemas.microsoft.com/office/word/2024/wordml/sdtformatlock" xmlns:w16du="http://schemas.microsoft.com/office/word/2023/wordml/word16du" xmlns:oel="http://schemas.microsoft.com/office/2019/extlst">
+                <mc:Fallback>
                   <w:pict>
-                    <v:line w14:anchorId="7EBD62A4" id="Conector recto 1" o:spid="_x0000_s1026" style="position:absolute;z-index:251671552;visibility:visible;mso-wrap-style:square;mso-width-percent:0;mso-height-percent:0;mso-wrap-distance-left:9pt;mso-wrap-distance-top:0;mso-wrap-distance-right:9pt;mso-wrap-distance-bottom:0;mso-position-horizontal:absolute;mso-position-horizontal-relative:text;mso-position-vertical:absolute;mso-position-vertical-relative:text;mso-width-percent:0;mso-height-percent:0;mso-width-relative:margin;mso-height-relative:margin" from="154.7pt,34.5pt" to="338.45pt,34.5pt" o:gfxdata="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" strokecolor="#7e97ad [3204]" strokeweight=".5pt">
+                    <v:line w14:anchorId="3E07ADDF" id="Conector recto 1" o:spid="_x0000_s1026" style="position:absolute;z-index:251671552;visibility:visible;mso-wrap-style:square;mso-width-percent:0;mso-height-percent:0;mso-wrap-distance-left:9pt;mso-wrap-distance-top:0;mso-wrap-distance-right:9pt;mso-wrap-distance-bottom:0;mso-position-horizontal:absolute;mso-position-horizontal-relative:text;mso-position-vertical:absolute;mso-position-vertical-relative:text;mso-width-percent:0;mso-height-percent:0;mso-width-relative:margin;mso-height-relative:margin" from="154.7pt,34.5pt" to="338.45pt,34.5pt" o:gfxdata="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" strokecolor="#7e97ad [3204]" strokeweight=".5pt">
                       <v:stroke joinstyle="miter"/>
                     </v:line>
                   </w:pict>
@@ -1547,7 +1536,7 @@
         </w:tc>
         <w:tc>
           <w:tcPr>
-            <w:tcW w:w="443" w:type="dxa"/>
+            <w:tcW w:w="419" w:type="dxa"/>
           </w:tcPr>
           <w:p>
             <w:pPr>
@@ -1557,9 +1546,12 @@
         </w:tc>
       </w:tr>
       <w:tr>
+        <w:trPr>
+          <w:trHeight w:val="582"/>
+        </w:trPr>
         <w:tc>
           <w:tcPr>
-            <w:tcW w:w="5608" w:type="dxa"/>
+            <w:tcW w:w="5954" w:type="dxa"/>
           </w:tcPr>
           <w:p>
             <w:pPr>
@@ -1572,12 +1564,11 @@
         </w:tc>
         <w:tc>
           <w:tcPr>
-            <w:tcW w:w="5608" w:type="dxa"/>
+            <w:tcW w:w="4511" w:type="dxa"/>
             <w:gridSpan w:val="2"/>
           </w:tcPr>
           <w:p>
             <w:pPr>
-              <w:jc w:val="center"/>
               <w:rPr>
                 <w:noProof/>
               </w:rPr>
@@ -1586,6 +1577,14 @@
         </w:tc>
       </w:tr>
     </w:tbl>
+    <w:p>
+      <w:pPr>
+        <w:rPr>
+          <w:sz w:val="10"/>
+          <w:szCs w:val="10"/>
+        </w:rPr>
+      </w:pPr>
+    </w:p>
     <w:p>
       <w:pPr>
         <w:tabs>
@@ -1597,8 +1596,8 @@
     <w:sectPr>
       <w:footerReference w:type="default" r:id="rId11"/>
       <w:footerReference w:type="first" r:id="rId12"/>
-      <w:pgSz w:w="11906" w:h="16838" w:code="9"/>
-      <w:pgMar w:top="357" w:right="340" w:bottom="709" w:left="340" w:header="862" w:footer="303" w:gutter="0"/>
+      <w:pgSz w:w="11906" w:h="8391" w:orient="landscape" w:code="11"/>
+      <w:pgMar w:top="340" w:right="709" w:bottom="340" w:left="357" w:header="862" w:footer="303" w:gutter="0"/>
       <w:cols w:space="720"/>
       <w:titlePg/>
       <w:docGrid w:linePitch="360"/>
@@ -1608,7 +1607,7 @@
 </file>
 
 <file path=word/endnotes.xml><?xml version="1.0" encoding="utf-8"?>
-<w:endnotes xmlns:wpc="http://schemas.microsoft.com/office/word/2010/wordprocessingCanvas" xmlns:cx="http://schemas.microsoft.com/office/drawing/2014/chartex" xmlns:cx1="http://schemas.microsoft.com/office/drawing/2015/9/8/chartex" xmlns:cx2="http://schemas.microsoft.com/office/drawing/2015/10/21/chartex" xmlns:cx3="http://schemas.microsoft.com/office/drawing/2016/5/9/chartex" xmlns:cx4="http://schemas.microsoft.com/office/drawing/2016/5/10/chartex" xmlns:cx5="http://schemas.microsoft.com/office/drawing/2016/5/11/chartex" xmlns:cx6="http://schemas.microsoft.com/office/drawing/2016/5/12/chartex" xmlns:cx7="http://schemas.microsoft.com/office/drawing/2016/5/13/chartex" xmlns:cx8="http://schemas.microsoft.com/office/drawing/2016/5/14/chartex" xmlns:mc="http://schemas.openxmlformats.org/markup-compatibility/2006" xmlns:aink="http://schemas.microsoft.com/office/drawing/2016/ink" xmlns:am3d="http://schemas.microsoft.com/office/drawing/2017/model3d" xmlns:o="urn:schemas-microsoft-com:office:office" xmlns:r="http://schemas.openxmlformats.org/officeDocument/2006/relationships" xmlns:m="http://schemas.openxmlformats.org/officeDocument/2006/math" xmlns:v="urn:schemas-microsoft-com:vml" xmlns:wp14="http://schemas.microsoft.com/office/word/2010/wordprocessingDrawing" xmlns:wp="http://schemas.openxmlformats.org/drawingml/2006/wordprocessingDrawing" xmlns:w10="urn:schemas-microsoft-com:office:word" xmlns:w="http://schemas.openxmlformats.org/wordprocessingml/2006/main" xmlns:w14="http://schemas.microsoft.com/office/word/2010/wordml" xmlns:w15="http://schemas.microsoft.com/office/word/2012/wordml" xmlns:w16cex="http://schemas.microsoft.com/office/word/2018/wordml/cex" xmlns:w16cid="http://schemas.microsoft.com/office/word/2016/wordml/cid" xmlns:w16="http://schemas.microsoft.com/office/word/2018/wordml" xmlns:w16sdtdh="http://schemas.microsoft.com/office/word/2020/wordml/sdtdatahash" xmlns:w16se="http://schemas.microsoft.com/office/word/2015/wordml/symex" xmlns:wpg="http://schemas.microsoft.com/office/word/2010/wordprocessingGroup" xmlns:wpi="http://schemas.microsoft.com/office/word/2010/wordprocessingInk" xmlns:wne="http://schemas.microsoft.com/office/word/2006/wordml" xmlns:wps="http://schemas.microsoft.com/office/word/2010/wordprocessingShape" mc:Ignorable="w14 w15 w16se w16cid w16 w16cex w16sdtdh wp14">
+<w:endnotes xmlns:wpc="http://schemas.microsoft.com/office/word/2010/wordprocessingCanvas" xmlns:cx="http://schemas.microsoft.com/office/drawing/2014/chartex" xmlns:cx1="http://schemas.microsoft.com/office/drawing/2015/9/8/chartex" xmlns:cx2="http://schemas.microsoft.com/office/drawing/2015/10/21/chartex" xmlns:cx3="http://schemas.microsoft.com/office/drawing/2016/5/9/chartex" xmlns:cx4="http://schemas.microsoft.com/office/drawing/2016/5/10/chartex" xmlns:cx5="http://schemas.microsoft.com/office/drawing/2016/5/11/chartex" xmlns:cx6="http://schemas.microsoft.com/office/drawing/2016/5/12/chartex" xmlns:cx7="http://schemas.microsoft.com/office/drawing/2016/5/13/chartex" xmlns:cx8="http://schemas.microsoft.com/office/drawing/2016/5/14/chartex" xmlns:mc="http://schemas.openxmlformats.org/markup-compatibility/2006" xmlns:aink="http://schemas.microsoft.com/office/drawing/2016/ink" xmlns:am3d="http://schemas.microsoft.com/office/drawing/2017/model3d" xmlns:o="urn:schemas-microsoft-com:office:office" xmlns:oel="http://schemas.microsoft.com/office/2019/extlst" xmlns:r="http://schemas.openxmlformats.org/officeDocument/2006/relationships" xmlns:m="http://schemas.openxmlformats.org/officeDocument/2006/math" xmlns:v="urn:schemas-microsoft-com:vml" xmlns:wp14="http://schemas.microsoft.com/office/word/2010/wordprocessingDrawing" xmlns:wp="http://schemas.openxmlformats.org/drawingml/2006/wordprocessingDrawing" xmlns:w10="urn:schemas-microsoft-com:office:word" xmlns:w="http://schemas.openxmlformats.org/wordprocessingml/2006/main" xmlns:w14="http://schemas.microsoft.com/office/word/2010/wordml" xmlns:w15="http://schemas.microsoft.com/office/word/2012/wordml" xmlns:w16cex="http://schemas.microsoft.com/office/word/2018/wordml/cex" xmlns:w16cid="http://schemas.microsoft.com/office/word/2016/wordml/cid" xmlns:w16="http://schemas.microsoft.com/office/word/2018/wordml" xmlns:w16du="http://schemas.microsoft.com/office/word/2023/wordml/word16du" xmlns:w16sdtdh="http://schemas.microsoft.com/office/word/2020/wordml/sdtdatahash" xmlns:w16sdtfl="http://schemas.microsoft.com/office/word/2024/wordml/sdtformatlock" xmlns:w16se="http://schemas.microsoft.com/office/word/2015/wordml/symex" xmlns:wpg="http://schemas.microsoft.com/office/word/2010/wordprocessingGroup" xmlns:wpi="http://schemas.microsoft.com/office/word/2010/wordprocessingInk" xmlns:wne="http://schemas.microsoft.com/office/word/2006/wordml" xmlns:wps="http://schemas.microsoft.com/office/word/2010/wordprocessingShape" mc:Ignorable="w14 w15 w16se w16cid w16 w16cex w16sdtdh w16sdtfl w16du wp14">
   <w:endnote w:type="separator" w:id="-1">
     <w:p>
       <w:pPr>
@@ -1635,7 +1634,7 @@
 </file>
 
 <file path=word/footer1.xml><?xml version="1.0" encoding="utf-8"?>
-<w:ftr xmlns:wpc="http://schemas.microsoft.com/office/word/2010/wordprocessingCanvas" xmlns:cx="http://schemas.microsoft.com/office/drawing/2014/chartex" xmlns:cx1="http://schemas.microsoft.com/office/drawing/2015/9/8/chartex" xmlns:cx2="http://schemas.microsoft.com/office/drawing/2015/10/21/chartex" xmlns:cx3="http://schemas.microsoft.com/office/drawing/2016/5/9/chartex" xmlns:cx4="http://schemas.microsoft.com/office/drawing/2016/5/10/chartex" xmlns:cx5="http://schemas.microsoft.com/office/drawing/2016/5/11/chartex" xmlns:cx6="http://schemas.microsoft.com/office/drawing/2016/5/12/chartex" xmlns:cx7="http://schemas.microsoft.com/office/drawing/2016/5/13/chartex" xmlns:cx8="http://schemas.microsoft.com/office/drawing/2016/5/14/chartex" xmlns:mc="http://schemas.openxmlformats.org/markup-compatibility/2006" xmlns:aink="http://schemas.microsoft.com/office/drawing/2016/ink" xmlns:am3d="http://schemas.microsoft.com/office/drawing/2017/model3d" xmlns:o="urn:schemas-microsoft-com:office:office" xmlns:r="http://schemas.openxmlformats.org/officeDocument/2006/relationships" xmlns:m="http://schemas.openxmlformats.org/officeDocument/2006/math" xmlns:v="urn:schemas-microsoft-com:vml" xmlns:wp14="http://schemas.microsoft.com/office/word/2010/wordprocessingDrawing" xmlns:wp="http://schemas.openxmlformats.org/drawingml/2006/wordprocessingDrawing" xmlns:w10="urn:schemas-microsoft-com:office:word" xmlns:w="http://schemas.openxmlformats.org/wordprocessingml/2006/main" xmlns:w14="http://schemas.microsoft.com/office/word/2010/wordml" xmlns:w15="http://schemas.microsoft.com/office/word/2012/wordml" xmlns:w16cex="http://schemas.microsoft.com/office/word/2018/wordml/cex" xmlns:w16cid="http://schemas.microsoft.com/office/word/2016/wordml/cid" xmlns:w16="http://schemas.microsoft.com/office/word/2018/wordml" xmlns:w16sdtdh="http://schemas.microsoft.com/office/word/2020/wordml/sdtdatahash" xmlns:w16se="http://schemas.microsoft.com/office/word/2015/wordml/symex" xmlns:wpg="http://schemas.microsoft.com/office/word/2010/wordprocessingGroup" xmlns:wpi="http://schemas.microsoft.com/office/word/2010/wordprocessingInk" xmlns:wne="http://schemas.microsoft.com/office/word/2006/wordml" xmlns:wps="http://schemas.microsoft.com/office/word/2010/wordprocessingShape" mc:Ignorable="w14 w15 w16se w16cid w16 w16cex w16sdtdh wp14">
+<w:ftr xmlns:wpc="http://schemas.microsoft.com/office/word/2010/wordprocessingCanvas" xmlns:cx="http://schemas.microsoft.com/office/drawing/2014/chartex" xmlns:cx1="http://schemas.microsoft.com/office/drawing/2015/9/8/chartex" xmlns:cx2="http://schemas.microsoft.com/office/drawing/2015/10/21/chartex" xmlns:cx3="http://schemas.microsoft.com/office/drawing/2016/5/9/chartex" xmlns:cx4="http://schemas.microsoft.com/office/drawing/2016/5/10/chartex" xmlns:cx5="http://schemas.microsoft.com/office/drawing/2016/5/11/chartex" xmlns:cx6="http://schemas.microsoft.com/office/drawing/2016/5/12/chartex" xmlns:cx7="http://schemas.microsoft.com/office/drawing/2016/5/13/chartex" xmlns:cx8="http://schemas.microsoft.com/office/drawing/2016/5/14/chartex" xmlns:mc="http://schemas.openxmlformats.org/markup-compatibility/2006" xmlns:aink="http://schemas.microsoft.com/office/drawing/2016/ink" xmlns:am3d="http://schemas.microsoft.com/office/drawing/2017/model3d" xmlns:o="urn:schemas-microsoft-com:office:office" xmlns:oel="http://schemas.microsoft.com/office/2019/extlst" xmlns:r="http://schemas.openxmlformats.org/officeDocument/2006/relationships" xmlns:m="http://schemas.openxmlformats.org/officeDocument/2006/math" xmlns:v="urn:schemas-microsoft-com:vml" xmlns:wp14="http://schemas.microsoft.com/office/word/2010/wordprocessingDrawing" xmlns:wp="http://schemas.openxmlformats.org/drawingml/2006/wordprocessingDrawing" xmlns:w10="urn:schemas-microsoft-com:office:word" xmlns:w="http://schemas.openxmlformats.org/wordprocessingml/2006/main" xmlns:w14="http://schemas.microsoft.com/office/word/2010/wordml" xmlns:w15="http://schemas.microsoft.com/office/word/2012/wordml" xmlns:w16cex="http://schemas.microsoft.com/office/word/2018/wordml/cex" xmlns:w16cid="http://schemas.microsoft.com/office/word/2016/wordml/cid" xmlns:w16="http://schemas.microsoft.com/office/word/2018/wordml" xmlns:w16du="http://schemas.microsoft.com/office/word/2023/wordml/word16du" xmlns:w16sdtdh="http://schemas.microsoft.com/office/word/2020/wordml/sdtdatahash" xmlns:w16sdtfl="http://schemas.microsoft.com/office/word/2024/wordml/sdtformatlock" xmlns:w16se="http://schemas.microsoft.com/office/word/2015/wordml/symex" xmlns:wpg="http://schemas.microsoft.com/office/word/2010/wordprocessingGroup" xmlns:wpi="http://schemas.microsoft.com/office/word/2010/wordprocessingInk" xmlns:wne="http://schemas.microsoft.com/office/word/2006/wordml" xmlns:wps="http://schemas.microsoft.com/office/word/2010/wordprocessingShape" mc:Ignorable="w14 w15 w16se w16cid w16 w16cex w16sdtdh w16sdtfl w16du wp14">
   <w:p>
     <w:pPr>
       <w:pStyle w:val="Piedepgina"/>
@@ -1700,7 +1699,7 @@
 </file>
 
 <file path=word/footer2.xml><?xml version="1.0" encoding="utf-8"?>
-<w:ftr xmlns:wpc="http://schemas.microsoft.com/office/word/2010/wordprocessingCanvas" xmlns:cx="http://schemas.microsoft.com/office/drawing/2014/chartex" xmlns:cx1="http://schemas.microsoft.com/office/drawing/2015/9/8/chartex" xmlns:cx2="http://schemas.microsoft.com/office/drawing/2015/10/21/chartex" xmlns:cx3="http://schemas.microsoft.com/office/drawing/2016/5/9/chartex" xmlns:cx4="http://schemas.microsoft.com/office/drawing/2016/5/10/chartex" xmlns:cx5="http://schemas.microsoft.com/office/drawing/2016/5/11/chartex" xmlns:cx6="http://schemas.microsoft.com/office/drawing/2016/5/12/chartex" xmlns:cx7="http://schemas.microsoft.com/office/drawing/2016/5/13/chartex" xmlns:cx8="http://schemas.microsoft.com/office/drawing/2016/5/14/chartex" xmlns:mc="http://schemas.openxmlformats.org/markup-compatibility/2006" xmlns:aink="http://schemas.microsoft.com/office/drawing/2016/ink" xmlns:am3d="http://schemas.microsoft.com/office/drawing/2017/model3d" xmlns:o="urn:schemas-microsoft-com:office:office" xmlns:r="http://schemas.openxmlformats.org/officeDocument/2006/relationships" xmlns:m="http://schemas.openxmlformats.org/officeDocument/2006/math" xmlns:v="urn:schemas-microsoft-com:vml" xmlns:wp14="http://schemas.microsoft.com/office/word/2010/wordprocessingDrawing" xmlns:wp="http://schemas.openxmlformats.org/drawingml/2006/wordprocessingDrawing" xmlns:w10="urn:schemas-microsoft-com:office:word" xmlns:w="http://schemas.openxmlformats.org/wordprocessingml/2006/main" xmlns:w14="http://schemas.microsoft.com/office/word/2010/wordml" xmlns:w15="http://schemas.microsoft.com/office/word/2012/wordml" xmlns:w16cex="http://schemas.microsoft.com/office/word/2018/wordml/cex" xmlns:w16cid="http://schemas.microsoft.com/office/word/2016/wordml/cid" xmlns:w16="http://schemas.microsoft.com/office/word/2018/wordml" xmlns:w16sdtdh="http://schemas.microsoft.com/office/word/2020/wordml/sdtdatahash" xmlns:w16se="http://schemas.microsoft.com/office/word/2015/wordml/symex" xmlns:wpg="http://schemas.microsoft.com/office/word/2010/wordprocessingGroup" xmlns:wpi="http://schemas.microsoft.com/office/word/2010/wordprocessingInk" xmlns:wne="http://schemas.microsoft.com/office/word/2006/wordml" xmlns:wps="http://schemas.microsoft.com/office/word/2010/wordprocessingShape" mc:Ignorable="w14 w15 w16se w16cid w16 w16cex w16sdtdh wp14">
+<w:ftr xmlns:wpc="http://schemas.microsoft.com/office/word/2010/wordprocessingCanvas" xmlns:cx="http://schemas.microsoft.com/office/drawing/2014/chartex" xmlns:cx1="http://schemas.microsoft.com/office/drawing/2015/9/8/chartex" xmlns:cx2="http://schemas.microsoft.com/office/drawing/2015/10/21/chartex" xmlns:cx3="http://schemas.microsoft.com/office/drawing/2016/5/9/chartex" xmlns:cx4="http://schemas.microsoft.com/office/drawing/2016/5/10/chartex" xmlns:cx5="http://schemas.microsoft.com/office/drawing/2016/5/11/chartex" xmlns:cx6="http://schemas.microsoft.com/office/drawing/2016/5/12/chartex" xmlns:cx7="http://schemas.microsoft.com/office/drawing/2016/5/13/chartex" xmlns:cx8="http://schemas.microsoft.com/office/drawing/2016/5/14/chartex" xmlns:mc="http://schemas.openxmlformats.org/markup-compatibility/2006" xmlns:aink="http://schemas.microsoft.com/office/drawing/2016/ink" xmlns:am3d="http://schemas.microsoft.com/office/drawing/2017/model3d" xmlns:o="urn:schemas-microsoft-com:office:office" xmlns:oel="http://schemas.microsoft.com/office/2019/extlst" xmlns:r="http://schemas.openxmlformats.org/officeDocument/2006/relationships" xmlns:m="http://schemas.openxmlformats.org/officeDocument/2006/math" xmlns:v="urn:schemas-microsoft-com:vml" xmlns:wp14="http://schemas.microsoft.com/office/word/2010/wordprocessingDrawing" xmlns:wp="http://schemas.openxmlformats.org/drawingml/2006/wordprocessingDrawing" xmlns:w10="urn:schemas-microsoft-com:office:word" xmlns:w="http://schemas.openxmlformats.org/wordprocessingml/2006/main" xmlns:w14="http://schemas.microsoft.com/office/word/2010/wordml" xmlns:w15="http://schemas.microsoft.com/office/word/2012/wordml" xmlns:w16cex="http://schemas.microsoft.com/office/word/2018/wordml/cex" xmlns:w16cid="http://schemas.microsoft.com/office/word/2016/wordml/cid" xmlns:w16="http://schemas.microsoft.com/office/word/2018/wordml" xmlns:w16du="http://schemas.microsoft.com/office/word/2023/wordml/word16du" xmlns:w16sdtdh="http://schemas.microsoft.com/office/word/2020/wordml/sdtdatahash" xmlns:w16sdtfl="http://schemas.microsoft.com/office/word/2024/wordml/sdtformatlock" xmlns:w16se="http://schemas.microsoft.com/office/word/2015/wordml/symex" xmlns:wpg="http://schemas.microsoft.com/office/word/2010/wordprocessingGroup" xmlns:wpi="http://schemas.microsoft.com/office/word/2010/wordprocessingInk" xmlns:wne="http://schemas.microsoft.com/office/word/2006/wordml" xmlns:wps="http://schemas.microsoft.com/office/word/2010/wordprocessingShape" mc:Ignorable="w14 w15 w16se w16cid w16 w16cex w16sdtdh w16sdtfl w16du wp14">
   <w:tbl>
     <w:tblPr>
       <w:tblStyle w:val="Tablaconcuadrcula"/>
@@ -1715,8 +1714,8 @@
       <w:tblLook w:val="04A0" w:firstRow="1" w:lastRow="0" w:firstColumn="1" w:lastColumn="0" w:noHBand="0" w:noVBand="1"/>
     </w:tblPr>
     <w:tblGrid>
-      <w:gridCol w:w="5608"/>
-      <w:gridCol w:w="5608"/>
+      <w:gridCol w:w="5423"/>
+      <w:gridCol w:w="5417"/>
     </w:tblGrid>
     <w:tr>
       <w:tc>
@@ -1942,7 +1941,7 @@
               <v:stroke joinstyle="miter"/>
               <v:path gradientshapeok="t" o:connecttype="rect"/>
             </v:shapetype>
-            <v:shape id="Cuadro de texto 2" o:spid="_x0000_s1027" type="#_x0000_t202" style="position:absolute;margin-left:168.2pt;margin-top:-12.8pt;width:211.85pt;height:17.05pt;z-index:251659264;visibility:visible;mso-wrap-style:square;mso-width-percent:0;mso-height-percent:0;mso-wrap-distance-left:9pt;mso-wrap-distance-top:3.6pt;mso-wrap-distance-right:9pt;mso-wrap-distance-bottom:3.6pt;mso-position-horizontal:absolute;mso-position-horizontal-relative:margin;mso-position-vertical:absolute;mso-position-vertical-relative:text;mso-width-percent:0;mso-height-percent:0;mso-width-relative:margin;mso-height-relative:margin;v-text-anchor:top" o:gfxdata="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" filled="f" stroked="f">
+            <v:shape id="Cuadro de texto 2" o:spid="_x0000_s1027" type="#_x0000_t202" style="position:absolute;margin-left:168.2pt;margin-top:-12.8pt;width:211.85pt;height:17.05pt;z-index:251659264;visibility:visible;mso-wrap-style:square;mso-width-percent:0;mso-height-percent:0;mso-wrap-distance-left:9pt;mso-wrap-distance-top:3.6pt;mso-wrap-distance-right:9pt;mso-wrap-distance-bottom:3.6pt;mso-position-horizontal:absolute;mso-position-horizontal-relative:margin;mso-position-vertical:absolute;mso-position-vertical-relative:text;mso-width-percent:0;mso-height-percent:0;mso-width-relative:margin;mso-height-relative:margin;v-text-anchor:top" o:gfxdata="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" filled="f" stroked="f">
               <v:textbox>
                 <w:txbxContent>
                   <w:p>
@@ -1971,7 +1970,7 @@
 </file>
 
 <file path=word/footnotes.xml><?xml version="1.0" encoding="utf-8"?>
-<w:footnotes xmlns:wpc="http://schemas.microsoft.com/office/word/2010/wordprocessingCanvas" xmlns:cx="http://schemas.microsoft.com/office/drawing/2014/chartex" xmlns:cx1="http://schemas.microsoft.com/office/drawing/2015/9/8/chartex" xmlns:cx2="http://schemas.microsoft.com/office/drawing/2015/10/21/chartex" xmlns:cx3="http://schemas.microsoft.com/office/drawing/2016/5/9/chartex" xmlns:cx4="http://schemas.microsoft.com/office/drawing/2016/5/10/chartex" xmlns:cx5="http://schemas.microsoft.com/office/drawing/2016/5/11/chartex" xmlns:cx6="http://schemas.microsoft.com/office/drawing/2016/5/12/chartex" xmlns:cx7="http://schemas.microsoft.com/office/drawing/2016/5/13/chartex" xmlns:cx8="http://schemas.microsoft.com/office/drawing/2016/5/14/chartex" xmlns:mc="http://schemas.openxmlformats.org/markup-compatibility/2006" xmlns:aink="http://schemas.microsoft.com/office/drawing/2016/ink" xmlns:am3d="http://schemas.microsoft.com/office/drawing/2017/model3d" xmlns:o="urn:schemas-microsoft-com:office:office" xmlns:r="http://schemas.openxmlformats.org/officeDocument/2006/relationships" xmlns:m="http://schemas.openxmlformats.org/officeDocument/2006/math" xmlns:v="urn:schemas-microsoft-com:vml" xmlns:wp14="http://schemas.microsoft.com/office/word/2010/wordprocessingDrawing" xmlns:wp="http://schemas.openxmlformats.org/drawingml/2006/wordprocessingDrawing" xmlns:w10="urn:schemas-microsoft-com:office:word" xmlns:w="http://schemas.openxmlformats.org/wordprocessingml/2006/main" xmlns:w14="http://schemas.microsoft.com/office/word/2010/wordml" xmlns:w15="http://schemas.microsoft.com/office/word/2012/wordml" xmlns:w16cex="http://schemas.microsoft.com/office/word/2018/wordml/cex" xmlns:w16cid="http://schemas.microsoft.com/office/word/2016/wordml/cid" xmlns:w16="http://schemas.microsoft.com/office/word/2018/wordml" xmlns:w16sdtdh="http://schemas.microsoft.com/office/word/2020/wordml/sdtdatahash" xmlns:w16se="http://schemas.microsoft.com/office/word/2015/wordml/symex" xmlns:wpg="http://schemas.microsoft.com/office/word/2010/wordprocessingGroup" xmlns:wpi="http://schemas.microsoft.com/office/word/2010/wordprocessingInk" xmlns:wne="http://schemas.microsoft.com/office/word/2006/wordml" xmlns:wps="http://schemas.microsoft.com/office/word/2010/wordprocessingShape" mc:Ignorable="w14 w15 w16se w16cid w16 w16cex w16sdtdh wp14">
+<w:footnotes xmlns:wpc="http://schemas.microsoft.com/office/word/2010/wordprocessingCanvas" xmlns:cx="http://schemas.microsoft.com/office/drawing/2014/chartex" xmlns:cx1="http://schemas.microsoft.com/office/drawing/2015/9/8/chartex" xmlns:cx2="http://schemas.microsoft.com/office/drawing/2015/10/21/chartex" xmlns:cx3="http://schemas.microsoft.com/office/drawing/2016/5/9/chartex" xmlns:cx4="http://schemas.microsoft.com/office/drawing/2016/5/10/chartex" xmlns:cx5="http://schemas.microsoft.com/office/drawing/2016/5/11/chartex" xmlns:cx6="http://schemas.microsoft.com/office/drawing/2016/5/12/chartex" xmlns:cx7="http://schemas.microsoft.com/office/drawing/2016/5/13/chartex" xmlns:cx8="http://schemas.microsoft.com/office/drawing/2016/5/14/chartex" xmlns:mc="http://schemas.openxmlformats.org/markup-compatibility/2006" xmlns:aink="http://schemas.microsoft.com/office/drawing/2016/ink" xmlns:am3d="http://schemas.microsoft.com/office/drawing/2017/model3d" xmlns:o="urn:schemas-microsoft-com:office:office" xmlns:oel="http://schemas.microsoft.com/office/2019/extlst" xmlns:r="http://schemas.openxmlformats.org/officeDocument/2006/relationships" xmlns:m="http://schemas.openxmlformats.org/officeDocument/2006/math" xmlns:v="urn:schemas-microsoft-com:vml" xmlns:wp14="http://schemas.microsoft.com/office/word/2010/wordprocessingDrawing" xmlns:wp="http://schemas.openxmlformats.org/drawingml/2006/wordprocessingDrawing" xmlns:w10="urn:schemas-microsoft-com:office:word" xmlns:w="http://schemas.openxmlformats.org/wordprocessingml/2006/main" xmlns:w14="http://schemas.microsoft.com/office/word/2010/wordml" xmlns:w15="http://schemas.microsoft.com/office/word/2012/wordml" xmlns:w16cex="http://schemas.microsoft.com/office/word/2018/wordml/cex" xmlns:w16cid="http://schemas.microsoft.com/office/word/2016/wordml/cid" xmlns:w16="http://schemas.microsoft.com/office/word/2018/wordml" xmlns:w16du="http://schemas.microsoft.com/office/word/2023/wordml/word16du" xmlns:w16sdtdh="http://schemas.microsoft.com/office/word/2020/wordml/sdtdatahash" xmlns:w16sdtfl="http://schemas.microsoft.com/office/word/2024/wordml/sdtformatlock" xmlns:w16se="http://schemas.microsoft.com/office/word/2015/wordml/symex" xmlns:wpg="http://schemas.microsoft.com/office/word/2010/wordprocessingGroup" xmlns:wpi="http://schemas.microsoft.com/office/word/2010/wordprocessingInk" xmlns:wne="http://schemas.microsoft.com/office/word/2006/wordml" xmlns:wps="http://schemas.microsoft.com/office/word/2010/wordprocessingShape" mc:Ignorable="w14 w15 w16se w16cid w16 w16cex w16sdtdh w16sdtfl w16du wp14">
   <w:footnote w:type="separator" w:id="-1">
     <w:p>
       <w:pPr>
@@ -1998,7 +1997,7 @@
 </file>
 
 <file path=word/numbering.xml><?xml version="1.0" encoding="utf-8"?>
-<w:numbering xmlns:wpc="http://schemas.microsoft.com/office/word/2010/wordprocessingCanvas" xmlns:cx="http://schemas.microsoft.com/office/drawing/2014/chartex" xmlns:cx1="http://schemas.microsoft.com/office/drawing/2015/9/8/chartex" xmlns:cx2="http://schemas.microsoft.com/office/drawing/2015/10/21/chartex" xmlns:cx3="http://schemas.microsoft.com/office/drawing/2016/5/9/chartex" xmlns:cx4="http://schemas.microsoft.com/office/drawing/2016/5/10/chartex" xmlns:cx5="http://schemas.microsoft.com/office/drawing/2016/5/11/chartex" xmlns:cx6="http://schemas.microsoft.com/office/drawing/2016/5/12/chartex" xmlns:cx7="http://schemas.microsoft.com/office/drawing/2016/5/13/chartex" xmlns:cx8="http://schemas.microsoft.com/office/drawing/2016/5/14/chartex" xmlns:mc="http://schemas.openxmlformats.org/markup-compatibility/2006" xmlns:aink="http://schemas.microsoft.com/office/drawing/2016/ink" xmlns:am3d="http://schemas.microsoft.com/office/drawing/2017/model3d" xmlns:o="urn:schemas-microsoft-com:office:office" xmlns:r="http://schemas.openxmlformats.org/officeDocument/2006/relationships" xmlns:m="http://schemas.openxmlformats.org/officeDocument/2006/math" xmlns:v="urn:schemas-microsoft-com:vml" xmlns:wp14="http://schemas.microsoft.com/office/word/2010/wordprocessingDrawing" xmlns:wp="http://schemas.openxmlformats.org/drawingml/2006/wordprocessingDrawing" xmlns:w10="urn:schemas-microsoft-com:office:word" xmlns:w="http://schemas.openxmlformats.org/wordprocessingml/2006/main" xmlns:w14="http://schemas.microsoft.com/office/word/2010/wordml" xmlns:w15="http://schemas.microsoft.com/office/word/2012/wordml" xmlns:w16cex="http://schemas.microsoft.com/office/word/2018/wordml/cex" xmlns:w16cid="http://schemas.microsoft.com/office/word/2016/wordml/cid" xmlns:w16="http://schemas.microsoft.com/office/word/2018/wordml" xmlns:w16sdtdh="http://schemas.microsoft.com/office/word/2020/wordml/sdtdatahash" xmlns:w16se="http://schemas.microsoft.com/office/word/2015/wordml/symex" xmlns:wpg="http://schemas.microsoft.com/office/word/2010/wordprocessingGroup" xmlns:wpi="http://schemas.microsoft.com/office/word/2010/wordprocessingInk" xmlns:wne="http://schemas.microsoft.com/office/word/2006/wordml" xmlns:wps="http://schemas.microsoft.com/office/word/2010/wordprocessingShape" mc:Ignorable="w14 w15 w16se w16cid w16 w16cex w16sdtdh wp14">
+<w:numbering xmlns:wpc="http://schemas.microsoft.com/office/word/2010/wordprocessingCanvas" xmlns:cx="http://schemas.microsoft.com/office/drawing/2014/chartex" xmlns:cx1="http://schemas.microsoft.com/office/drawing/2015/9/8/chartex" xmlns:cx2="http://schemas.microsoft.com/office/drawing/2015/10/21/chartex" xmlns:cx3="http://schemas.microsoft.com/office/drawing/2016/5/9/chartex" xmlns:cx4="http://schemas.microsoft.com/office/drawing/2016/5/10/chartex" xmlns:cx5="http://schemas.microsoft.com/office/drawing/2016/5/11/chartex" xmlns:cx6="http://schemas.microsoft.com/office/drawing/2016/5/12/chartex" xmlns:cx7="http://schemas.microsoft.com/office/drawing/2016/5/13/chartex" xmlns:cx8="http://schemas.microsoft.com/office/drawing/2016/5/14/chartex" xmlns:mc="http://schemas.openxmlformats.org/markup-compatibility/2006" xmlns:aink="http://schemas.microsoft.com/office/drawing/2016/ink" xmlns:am3d="http://schemas.microsoft.com/office/drawing/2017/model3d" xmlns:o="urn:schemas-microsoft-com:office:office" xmlns:oel="http://schemas.microsoft.com/office/2019/extlst" xmlns:r="http://schemas.openxmlformats.org/officeDocument/2006/relationships" xmlns:m="http://schemas.openxmlformats.org/officeDocument/2006/math" xmlns:v="urn:schemas-microsoft-com:vml" xmlns:wp14="http://schemas.microsoft.com/office/word/2010/wordprocessingDrawing" xmlns:wp="http://schemas.openxmlformats.org/drawingml/2006/wordprocessingDrawing" xmlns:w10="urn:schemas-microsoft-com:office:word" xmlns:w="http://schemas.openxmlformats.org/wordprocessingml/2006/main" xmlns:w14="http://schemas.microsoft.com/office/word/2010/wordml" xmlns:w15="http://schemas.microsoft.com/office/word/2012/wordml" xmlns:w16cex="http://schemas.microsoft.com/office/word/2018/wordml/cex" xmlns:w16cid="http://schemas.microsoft.com/office/word/2016/wordml/cid" xmlns:w16="http://schemas.microsoft.com/office/word/2018/wordml" xmlns:w16du="http://schemas.microsoft.com/office/word/2023/wordml/word16du" xmlns:w16sdtdh="http://schemas.microsoft.com/office/word/2020/wordml/sdtdatahash" xmlns:w16sdtfl="http://schemas.microsoft.com/office/word/2024/wordml/sdtformatlock" xmlns:w16se="http://schemas.microsoft.com/office/word/2015/wordml/symex" xmlns:wpg="http://schemas.microsoft.com/office/word/2010/wordprocessingGroup" xmlns:wpi="http://schemas.microsoft.com/office/word/2010/wordprocessingInk" xmlns:wne="http://schemas.microsoft.com/office/word/2006/wordml" xmlns:wps="http://schemas.microsoft.com/office/word/2010/wordprocessingShape" mc:Ignorable="w14 w15 w16se w16cid w16 w16cex w16sdtdh w16sdtfl w16du wp14">
   <w:abstractNum w:abstractNumId="0" w15:restartNumberingAfterBreak="0">
     <w:nsid w:val="FFFFFF7C"/>
     <w:multiLevelType w:val="singleLevel"/>
@@ -2084,26 +2083,26 @@
       </w:pPr>
     </w:lvl>
   </w:abstractNum>
-  <w:num w:numId="1">
+  <w:num w:numId="1" w16cid:durableId="1960600744">
     <w:abstractNumId w:val="4"/>
   </w:num>
-  <w:num w:numId="2">
+  <w:num w:numId="2" w16cid:durableId="54085653">
     <w:abstractNumId w:val="3"/>
   </w:num>
-  <w:num w:numId="3">
+  <w:num w:numId="3" w16cid:durableId="540703548">
     <w:abstractNumId w:val="2"/>
   </w:num>
-  <w:num w:numId="4">
+  <w:num w:numId="4" w16cid:durableId="958218273">
     <w:abstractNumId w:val="1"/>
   </w:num>
-  <w:num w:numId="5">
+  <w:num w:numId="5" w16cid:durableId="1873229258">
     <w:abstractNumId w:val="0"/>
   </w:num>
 </w:numbering>
 </file>
 
 <file path=word/styles.xml><?xml version="1.0" encoding="utf-8"?>
-<w:styles xmlns:mc="http://schemas.openxmlformats.org/markup-compatibility/2006" xmlns:r="http://schemas.openxmlformats.org/officeDocument/2006/relationships" xmlns:w="http://schemas.openxmlformats.org/wordprocessingml/2006/main" xmlns:w14="http://schemas.microsoft.com/office/word/2010/wordml" xmlns:w15="http://schemas.microsoft.com/office/word/2012/wordml" xmlns:w16cex="http://schemas.microsoft.com/office/word/2018/wordml/cex" xmlns:w16cid="http://schemas.microsoft.com/office/word/2016/wordml/cid" xmlns:w16="http://schemas.microsoft.com/office/word/2018/wordml" xmlns:w16sdtdh="http://schemas.microsoft.com/office/word/2020/wordml/sdtdatahash" xmlns:w16se="http://schemas.microsoft.com/office/word/2015/wordml/symex" mc:Ignorable="w14 w15 w16se w16cid w16 w16cex w16sdtdh">
+<w:styles xmlns:mc="http://schemas.openxmlformats.org/markup-compatibility/2006" xmlns:r="http://schemas.openxmlformats.org/officeDocument/2006/relationships" xmlns:w="http://schemas.openxmlformats.org/wordprocessingml/2006/main" xmlns:w14="http://schemas.microsoft.com/office/word/2010/wordml" xmlns:w15="http://schemas.microsoft.com/office/word/2012/wordml" xmlns:w16cex="http://schemas.microsoft.com/office/word/2018/wordml/cex" xmlns:w16cid="http://schemas.microsoft.com/office/word/2016/wordml/cid" xmlns:w16="http://schemas.microsoft.com/office/word/2018/wordml" xmlns:w16du="http://schemas.microsoft.com/office/word/2023/wordml/word16du" xmlns:w16sdtdh="http://schemas.microsoft.com/office/word/2020/wordml/sdtdatahash" xmlns:w16sdtfl="http://schemas.microsoft.com/office/word/2024/wordml/sdtformatlock" xmlns:w16se="http://schemas.microsoft.com/office/word/2015/wordml/symex" mc:Ignorable="w14 w15 w16se w16cid w16 w16cex w16sdtdh w16sdtfl w16du">
   <w:docDefaults>
     <w:rPrDefault>
       <w:rPr>
@@ -2962,7 +2961,7 @@
       <w:szCs w:val="18"/>
     </w:rPr>
   </w:style>
-  <w:style w:type="character" w:styleId="Textoennegrita">
+  <w:style w:type="character" w:styleId="Fuerte">
     <w:name w:val="Strong"/>
     <w:basedOn w:val="Fuentedeprrafopredeter"/>
     <w:uiPriority w:val="4"/>
@@ -3915,23 +3914,6 @@
 </file>
 
 <file path=customXml/item1.xml><?xml version="1.0" encoding="utf-8"?>
-<?mso-contentType ?>
-<FormTemplates xmlns="http://schemas.microsoft.com/sharepoint/v3/contenttype/forms">
-  <Display>DocumentLibraryForm</Display>
-  <Edit>DocumentLibraryForm</Edit>
-  <New>DocumentLibraryForm</New>
-</FormTemplates>
-</file>
-
-<file path=customXml/item2.xml><?xml version="1.0" encoding="utf-8"?>
-<p:properties xmlns:p="http://schemas.microsoft.com/office/2006/metadata/properties" xmlns:xsi="http://www.w3.org/2001/XMLSchema-instance" xmlns:pc="http://schemas.microsoft.com/office/infopath/2007/PartnerControls">
-  <documentManagement>
-    <MediaServiceKeyPoints xmlns="71af3243-3dd4-4a8d-8c0d-dd76da1f02a5" xsi:nil="true"/>
-  </documentManagement>
-</p:properties>
-</file>
-
-<file path=customXml/item3.xml><?xml version="1.0" encoding="utf-8"?>
 <ct:contentTypeSchema xmlns:ct="http://schemas.microsoft.com/office/2006/metadata/contentType" xmlns:ma="http://schemas.microsoft.com/office/2006/metadata/properties/metaAttributes" ct:_="" ma:_="" ma:contentTypeName="Document" ma:contentTypeID="0x01010079F111ED35F8CC479449609E8A0923A6" ma:contentTypeVersion="11" ma:contentTypeDescription="Create a new document." ma:contentTypeScope="" ma:versionID="1c2eb7a32e66fb6e4260f3771546a5e2">
   <xsd:schema xmlns:xsd="http://www.w3.org/2001/XMLSchema" xmlns:xs="http://www.w3.org/2001/XMLSchema" xmlns:p="http://schemas.microsoft.com/office/2006/metadata/properties" xmlns:ns2="71af3243-3dd4-4a8d-8c0d-dd76da1f02a5" xmlns:ns3="16c05727-aa75-4e4a-9b5f-8a80a1165891" targetNamespace="http://schemas.microsoft.com/office/2006/metadata/properties" ma:root="true" ma:fieldsID="04e1f6479c48b08974ba73b5ca973489" ns2:_="" ns3:_="">
     <xsd:import namespace="71af3243-3dd4-4a8d-8c0d-dd76da1f02a5"/>
@@ -4142,29 +4124,28 @@
 </ct:contentTypeSchema>
 </file>
 
+<file path=customXml/item2.xml><?xml version="1.0" encoding="utf-8"?>
+<p:properties xmlns:p="http://schemas.microsoft.com/office/2006/metadata/properties" xmlns:xsi="http://www.w3.org/2001/XMLSchema-instance" xmlns:pc="http://schemas.microsoft.com/office/infopath/2007/PartnerControls">
+  <documentManagement>
+    <MediaServiceKeyPoints xmlns="71af3243-3dd4-4a8d-8c0d-dd76da1f02a5" xsi:nil="true"/>
+  </documentManagement>
+</p:properties>
+</file>
+
+<file path=customXml/item3.xml><?xml version="1.0" encoding="utf-8"?>
+<?mso-contentType ?>
+<FormTemplates xmlns="http://schemas.microsoft.com/sharepoint/v3/contenttype/forms">
+  <Display>DocumentLibraryForm</Display>
+  <Edit>DocumentLibraryForm</Edit>
+  <New>DocumentLibraryForm</New>
+</FormTemplates>
+</file>
+
 <file path=customXml/item4.xml><?xml version="1.0" encoding="utf-8"?>
 <b:Sources xmlns:b="http://schemas.openxmlformats.org/officeDocument/2006/bibliography" xmlns="http://schemas.openxmlformats.org/officeDocument/2006/bibliography" SelectedStyle="\APASixthEditionOfficeOnline.xsl" StyleName="APA" Version="6"/>
 </file>
 
 <file path=customXml/itemProps1.xml><?xml version="1.0" encoding="utf-8"?>
-<ds:datastoreItem xmlns:ds="http://schemas.openxmlformats.org/officeDocument/2006/customXml" ds:itemID="{BEA6D05B-AD60-405F-B8DB-FC61ABCDF8E2}">
-  <ds:schemaRefs>
-    <ds:schemaRef ds:uri="http://schemas.microsoft.com/sharepoint/v3/contenttype/forms"/>
-  </ds:schemaRefs>
-</ds:datastoreItem>
-</file>
-
-<file path=customXml/itemProps2.xml><?xml version="1.0" encoding="utf-8"?>
-<ds:datastoreItem xmlns:ds="http://schemas.openxmlformats.org/officeDocument/2006/customXml" ds:itemID="{B550BB7C-2FBC-4612-9ECE-2EA076035D14}">
-  <ds:schemaRefs>
-    <ds:schemaRef ds:uri="http://schemas.microsoft.com/office/2006/metadata/properties"/>
-    <ds:schemaRef ds:uri="http://schemas.microsoft.com/office/infopath/2007/PartnerControls"/>
-    <ds:schemaRef ds:uri="71af3243-3dd4-4a8d-8c0d-dd76da1f02a5"/>
-  </ds:schemaRefs>
-</ds:datastoreItem>
-</file>
-
-<file path=customXml/itemProps3.xml><?xml version="1.0" encoding="utf-8"?>
 <ds:datastoreItem xmlns:ds="http://schemas.openxmlformats.org/officeDocument/2006/customXml" ds:itemID="{23573660-FE3A-4463-827C-CAE2430F8500}">
   <ds:schemaRefs>
     <ds:schemaRef ds:uri="http://schemas.microsoft.com/office/2006/metadata/contentType"/>
@@ -4183,6 +4164,24 @@
 </ds:datastoreItem>
 </file>
 
+<file path=customXml/itemProps2.xml><?xml version="1.0" encoding="utf-8"?>
+<ds:datastoreItem xmlns:ds="http://schemas.openxmlformats.org/officeDocument/2006/customXml" ds:itemID="{B550BB7C-2FBC-4612-9ECE-2EA076035D14}">
+  <ds:schemaRefs>
+    <ds:schemaRef ds:uri="http://schemas.microsoft.com/office/2006/metadata/properties"/>
+    <ds:schemaRef ds:uri="http://schemas.microsoft.com/office/infopath/2007/PartnerControls"/>
+    <ds:schemaRef ds:uri="71af3243-3dd4-4a8d-8c0d-dd76da1f02a5"/>
+  </ds:schemaRefs>
+</ds:datastoreItem>
+</file>
+
+<file path=customXml/itemProps3.xml><?xml version="1.0" encoding="utf-8"?>
+<ds:datastoreItem xmlns:ds="http://schemas.openxmlformats.org/officeDocument/2006/customXml" ds:itemID="{BEA6D05B-AD60-405F-B8DB-FC61ABCDF8E2}">
+  <ds:schemaRefs>
+    <ds:schemaRef ds:uri="http://schemas.microsoft.com/sharepoint/v3/contenttype/forms"/>
+  </ds:schemaRefs>
+</ds:datastoreItem>
+</file>
+
 <file path=customXml/itemProps4.xml><?xml version="1.0" encoding="utf-8"?>
 <ds:datastoreItem xmlns:ds="http://schemas.openxmlformats.org/officeDocument/2006/customXml" ds:itemID="{15FB23E4-45D6-411F-89ED-62A8EB1B1927}">
   <ds:schemaRefs>

</xml_diff>

<commit_message>
actualizar campos de exportacion de analytica
</commit_message>
<xml_diff>
--- a/pesaje/analytica/Report/PrintLoteGuiaRecepcion.docx
+++ b/pesaje/analytica/Report/PrintLoteGuiaRecepcion.docx
@@ -1561,6 +1561,27 @@
       </w:tr>
       <w:tr>
         <w:trPr>
+          <w:trHeight w:val="321"/>
+        </w:trPr>
+        <w:tc>
+          <w:tcPr>
+            <w:tcW w:w="10465" w:type="dxa"/>
+            <w:gridSpan w:val="2"/>
+          </w:tcPr>
+          <w:p>
+            <w:pPr>
+              <w:rPr>
+                <w:noProof/>
+              </w:rPr>
+            </w:pPr>
+            <w:r>
+              <w:t xml:space="preserve">                                                                              REPRESENTANTE/PROVEEDOR</w:t>
+            </w:r>
+          </w:p>
+        </w:tc>
+      </w:tr>
+      <w:tr>
+        <w:trPr>
           <w:trHeight w:val="582"/>
         </w:trPr>
         <w:tc>
@@ -1570,12 +1591,69 @@
           </w:tcPr>
           <w:p>
             <w:pPr>
-              <w:rPr>
-                <w:noProof/>
-              </w:rPr>
+              <w:jc w:val="center"/>
             </w:pPr>
             <w:r>
-              <w:t xml:space="preserve">                                                                              REPRESENTANTE/PROVEEDOR</w:t>
+              <w:rPr>
+                <w:rFonts w:cs="Arial"/>
+                <w:caps/>
+                <w:noProof/>
+              </w:rPr>
+              <w:t>DNI</w:t>
+            </w:r>
+            <w:r>
+              <w:rPr>
+                <w:rFonts w:ascii="Arial" w:hAnsi="Arial" w:cs="Arial"/>
+                <w:caps/>
+                <w:noProof/>
+              </w:rPr>
+              <w:t>:</w:t>
+            </w:r>
+            <w:r>
+              <w:rPr>
+                <w:rFonts w:ascii="Arial" w:hAnsi="Arial" w:cs="Arial"/>
+                <w:caps/>
+                <w:noProof/>
+              </w:rPr>
+              <w:t xml:space="preserve"> </w:t>
+            </w:r>
+            <w:r>
+              <w:rPr>
+                <w:rFonts w:ascii="Arial" w:hAnsi="Arial" w:cs="Arial"/>
+                <w:caps/>
+                <w:noProof/>
+              </w:rPr>
+              <w:fldChar w:fldCharType="begin"/>
+            </w:r>
+            <w:r>
+              <w:rPr>
+                <w:rFonts w:ascii="Arial" w:hAnsi="Arial" w:cs="Arial"/>
+                <w:noProof/>
+              </w:rPr>
+              <w:instrText xml:space="preserve"> MERGEFIELD  nro_doc_conductor  \* MERGEFORMAT </w:instrText>
+            </w:r>
+            <w:r>
+              <w:rPr>
+                <w:rFonts w:ascii="Arial" w:hAnsi="Arial" w:cs="Arial"/>
+                <w:caps/>
+                <w:noProof/>
+              </w:rPr>
+              <w:fldChar w:fldCharType="separate"/>
+            </w:r>
+            <w:r>
+              <w:rPr>
+                <w:rFonts w:ascii="Arial" w:hAnsi="Arial" w:cs="Arial"/>
+                <w:noProof/>
+              </w:rPr>
+              <w:t>«nro_doc_conductor»</w:t>
+            </w:r>
+            <w:r>
+              <w:rPr>
+                <w:rFonts w:ascii="Arial" w:hAnsi="Arial" w:cs="Arial"/>
+                <w:caps/>
+                <w:noProof/>
+              </w:rPr>
+              <w:fldChar w:fldCharType="end"/>
             </w:r>
           </w:p>
         </w:tc>
@@ -3918,23 +3996,10 @@
 </file>
 
 <file path=customXml/item1.xml><?xml version="1.0" encoding="utf-8"?>
-<?mso-contentType ?>
-<FormTemplates xmlns="http://schemas.microsoft.com/sharepoint/v3/contenttype/forms">
-  <Display>DocumentLibraryForm</Display>
-  <Edit>DocumentLibraryForm</Edit>
-  <New>DocumentLibraryForm</New>
-</FormTemplates>
+<b:Sources xmlns:b="http://schemas.openxmlformats.org/officeDocument/2006/bibliography" xmlns="http://schemas.openxmlformats.org/officeDocument/2006/bibliography" SelectedStyle="\APASixthEditionOfficeOnline.xsl" StyleName="APA" Version="6"/>
 </file>
 
 <file path=customXml/item2.xml><?xml version="1.0" encoding="utf-8"?>
-<p:properties xmlns:p="http://schemas.microsoft.com/office/2006/metadata/properties" xmlns:xsi="http://www.w3.org/2001/XMLSchema-instance" xmlns:pc="http://schemas.microsoft.com/office/infopath/2007/PartnerControls">
-  <documentManagement>
-    <MediaServiceKeyPoints xmlns="71af3243-3dd4-4a8d-8c0d-dd76da1f02a5" xsi:nil="true"/>
-  </documentManagement>
-</p:properties>
-</file>
-
-<file path=customXml/item3.xml><?xml version="1.0" encoding="utf-8"?>
 <ct:contentTypeSchema xmlns:ct="http://schemas.microsoft.com/office/2006/metadata/contentType" xmlns:ma="http://schemas.microsoft.com/office/2006/metadata/properties/metaAttributes" ct:_="" ma:_="" ma:contentTypeName="Document" ma:contentTypeID="0x01010079F111ED35F8CC479449609E8A0923A6" ma:contentTypeVersion="11" ma:contentTypeDescription="Create a new document." ma:contentTypeScope="" ma:versionID="1c2eb7a32e66fb6e4260f3771546a5e2">
   <xsd:schema xmlns:xsd="http://www.w3.org/2001/XMLSchema" xmlns:xs="http://www.w3.org/2001/XMLSchema" xmlns:p="http://schemas.microsoft.com/office/2006/metadata/properties" xmlns:ns2="71af3243-3dd4-4a8d-8c0d-dd76da1f02a5" xmlns:ns3="16c05727-aa75-4e4a-9b5f-8a80a1165891" targetNamespace="http://schemas.microsoft.com/office/2006/metadata/properties" ma:root="true" ma:fieldsID="04e1f6479c48b08974ba73b5ca973489" ns2:_="" ns3:_="">
     <xsd:import namespace="71af3243-3dd4-4a8d-8c0d-dd76da1f02a5"/>
@@ -4145,29 +4210,32 @@
 </ct:contentTypeSchema>
 </file>
 
+<file path=customXml/item3.xml><?xml version="1.0" encoding="utf-8"?>
+<p:properties xmlns:p="http://schemas.microsoft.com/office/2006/metadata/properties" xmlns:xsi="http://www.w3.org/2001/XMLSchema-instance" xmlns:pc="http://schemas.microsoft.com/office/infopath/2007/PartnerControls">
+  <documentManagement>
+    <MediaServiceKeyPoints xmlns="71af3243-3dd4-4a8d-8c0d-dd76da1f02a5" xsi:nil="true"/>
+  </documentManagement>
+</p:properties>
+</file>
+
 <file path=customXml/item4.xml><?xml version="1.0" encoding="utf-8"?>
-<b:Sources xmlns:b="http://schemas.openxmlformats.org/officeDocument/2006/bibliography" xmlns="http://schemas.openxmlformats.org/officeDocument/2006/bibliography" SelectedStyle="\APASixthEditionOfficeOnline.xsl" StyleName="APA" Version="6"/>
+<?mso-contentType ?>
+<FormTemplates xmlns="http://schemas.microsoft.com/sharepoint/v3/contenttype/forms">
+  <Display>DocumentLibraryForm</Display>
+  <Edit>DocumentLibraryForm</Edit>
+  <New>DocumentLibraryForm</New>
+</FormTemplates>
 </file>
 
 <file path=customXml/itemProps1.xml><?xml version="1.0" encoding="utf-8"?>
-<ds:datastoreItem xmlns:ds="http://schemas.openxmlformats.org/officeDocument/2006/customXml" ds:itemID="{BEA6D05B-AD60-405F-B8DB-FC61ABCDF8E2}">
+<ds:datastoreItem xmlns:ds="http://schemas.openxmlformats.org/officeDocument/2006/customXml" ds:itemID="{15FB23E4-45D6-411F-89ED-62A8EB1B1927}">
   <ds:schemaRefs>
-    <ds:schemaRef ds:uri="http://schemas.microsoft.com/sharepoint/v3/contenttype/forms"/>
+    <ds:schemaRef ds:uri="http://schemas.openxmlformats.org/officeDocument/2006/bibliography"/>
   </ds:schemaRefs>
 </ds:datastoreItem>
 </file>
 
 <file path=customXml/itemProps2.xml><?xml version="1.0" encoding="utf-8"?>
-<ds:datastoreItem xmlns:ds="http://schemas.openxmlformats.org/officeDocument/2006/customXml" ds:itemID="{B550BB7C-2FBC-4612-9ECE-2EA076035D14}">
-  <ds:schemaRefs>
-    <ds:schemaRef ds:uri="http://schemas.microsoft.com/office/2006/metadata/properties"/>
-    <ds:schemaRef ds:uri="http://schemas.microsoft.com/office/infopath/2007/PartnerControls"/>
-    <ds:schemaRef ds:uri="71af3243-3dd4-4a8d-8c0d-dd76da1f02a5"/>
-  </ds:schemaRefs>
-</ds:datastoreItem>
-</file>
-
-<file path=customXml/itemProps3.xml><?xml version="1.0" encoding="utf-8"?>
 <ds:datastoreItem xmlns:ds="http://schemas.openxmlformats.org/officeDocument/2006/customXml" ds:itemID="{23573660-FE3A-4463-827C-CAE2430F8500}">
   <ds:schemaRefs>
     <ds:schemaRef ds:uri="http://schemas.microsoft.com/office/2006/metadata/contentType"/>
@@ -4186,10 +4254,20 @@
 </ds:datastoreItem>
 </file>
 
+<file path=customXml/itemProps3.xml><?xml version="1.0" encoding="utf-8"?>
+<ds:datastoreItem xmlns:ds="http://schemas.openxmlformats.org/officeDocument/2006/customXml" ds:itemID="{B550BB7C-2FBC-4612-9ECE-2EA076035D14}">
+  <ds:schemaRefs>
+    <ds:schemaRef ds:uri="http://schemas.microsoft.com/office/2006/metadata/properties"/>
+    <ds:schemaRef ds:uri="http://schemas.microsoft.com/office/infopath/2007/PartnerControls"/>
+    <ds:schemaRef ds:uri="71af3243-3dd4-4a8d-8c0d-dd76da1f02a5"/>
+  </ds:schemaRefs>
+</ds:datastoreItem>
+</file>
+
 <file path=customXml/itemProps4.xml><?xml version="1.0" encoding="utf-8"?>
-<ds:datastoreItem xmlns:ds="http://schemas.openxmlformats.org/officeDocument/2006/customXml" ds:itemID="{15FB23E4-45D6-411F-89ED-62A8EB1B1927}">
+<ds:datastoreItem xmlns:ds="http://schemas.openxmlformats.org/officeDocument/2006/customXml" ds:itemID="{BEA6D05B-AD60-405F-B8DB-FC61ABCDF8E2}">
   <ds:schemaRefs>
-    <ds:schemaRef ds:uri="http://schemas.openxmlformats.org/officeDocument/2006/bibliography"/>
+    <ds:schemaRef ds:uri="http://schemas.microsoft.com/sharepoint/v3/contenttype/forms"/>
   </ds:schemaRefs>
 </ds:datastoreItem>
 </file>
</xml_diff>